<commit_message>
Fix Lab 3/4/5 consistency: Assigned notification, Booked to Pending Pickup, Delayed history entry
</commit_message>
<xml_diff>
--- a/Documents/COE420_Lab4_Team10.docx
+++ b/Documents/COE420_Lab4_Team10.docx
@@ -2802,7 +2802,7 @@
                 <w:sz w:val="20"/>
                 <w:szCs w:val="20"/>
               </w:rPr>
-              <w:t xml:space="preserve">P3, P4, P5</w:t>
+              <w:t xml:space="preserve">P2, P3, P4, P5</w:t>
             </w:r>
           </w:p>
         </w:tc>
@@ -6201,7 +6201,7 @@
                 <w:sz w:val="18"/>
                 <w:szCs w:val="18"/>
               </w:rPr>
-              <w:t xml:space="preserve">Parcel record (D2 Parcels), Booking confirmation and tracking number (Customer)</w:t>
+              <w:t xml:space="preserve">Parcel record (D2 Parcels), Booking confirmation and tracking number (Customer), Status history entry (D3 Status History)</w:t>
             </w:r>
           </w:p>
         </w:tc>
@@ -6233,7 +6233,7 @@
                 <w:sz w:val="18"/>
                 <w:szCs w:val="18"/>
               </w:rPr>
-              <w:t xml:space="preserve">Only a logged-in customer can book. The booking is not confirmed if a mandatory field is empty, the recipient's phone is not a valid UAE number (+971 followed by 9 digits), the weight is not more than 0 and at most 70 kg, or any dimension (length, width, height) is not more than 0 and at most 150 cm. Every confirmed booking gets a unique tracking number in the format CPT-XXXXXX, shown on the confirmation page together with the expected delivery window: 24 hours from pickup if the recipient is in the same emirate as the sender, 48 hours if it is in a different emirate.</w:t>
+              <w:t xml:space="preserve">Only a logged-in customer can book. The booking is not confirmed if a mandatory field is empty, the recipient's phone is not a valid UAE number (+971 followed by 9 digits), the weight is not more than 0 and at most 70 kg, or any dimension (length, width, height) is not more than 0 and at most 150 cm. Every confirmed booking gets a unique tracking number in the format CPT-XXXXXX, shown on the confirmation page together with the expected delivery window: 24 hours from pickup if the recipient is in the same emirate as the sender, 48 hours if it is in a different emirate. Once the booking is confirmed, the system automatically sets the parcel's status to Pending Pickup and adds a D3 entry (status, timestamp).</w:t>
             </w:r>
           </w:p>
         </w:tc>
@@ -6367,7 +6367,7 @@
                 <w:sz w:val="18"/>
                 <w:szCs w:val="18"/>
               </w:rPr>
-              <w:t xml:space="preserve">Only a logged-in admin can assign parcels, and only confirmed bookings can be assigned to active field staff accounts. Reassigning is allowed only before pickup. Assigning sets the status to Assigned, updates D2, adds a D3 entry (status, timestamp, admin) and notifies the field staff member. An undelivered parcel with no status change for 48 hours is set to Delayed and an alert goes to the admin.</w:t>
+              <w:t xml:space="preserve">Only a logged-in admin can assign parcels, and only confirmed bookings can be assigned to active field staff accounts. Reassigning is allowed only before pickup. Assigning sets the status to Assigned, updates D2, adds a D3 entry (status, timestamp, admin) and notifies the field staff member. P5 then sends each parcel's customer an Assigned status notification (FR-09). An undelivered parcel with no status change for 48 hours is set to Delayed, a D3 entry is added and an alert goes to the admin.</w:t>
             </w:r>
           </w:p>
         </w:tc>
@@ -6635,7 +6635,7 @@
                 <w:sz w:val="18"/>
                 <w:szCs w:val="18"/>
               </w:rPr>
-              <w:t xml:space="preserve">1. Tracking number must exist, otherwise the customer gets a "not found" message and nothing else is shown. 2. A customer sees only their own parcels. 3. Admin can view the full tracking history of any parcel by Parcel ID. 4. History is shown in chronological order, each entry with status, date/time and location or staff. 5. A Status notification is sent to the Customer on every status change from P4 (Picked Up, In Transit, Out for Delivery, Attempted, Delivered, Returned to Sender). 6. Each notification is sent once per status change, no duplicates. 7. Read-only: P5 never changes the parcel status.</w:t>
+              <w:t xml:space="preserve">1. Tracking number must exist, otherwise the customer gets a "not found" message and nothing else is shown. 2. A customer sees only their own parcels. 3. Admin can view the full tracking history of any parcel by Parcel ID. 4. History is shown in chronological order, each entry with status, date/time and location or staff. 5. A Status notification is sent to the Customer on every status change recorded in D3 (FR-16): Pending Pickup from P2, Assigned and Delayed from P3, and Picked Up, In Transit, Out for Delivery, Attempted, Delivered and Returned to Sender from P4. 6. Each notification is sent once per status change, no duplicates. 7. Read-only: P5 never changes the parcel status.</w:t>
             </w:r>
           </w:p>
         </w:tc>

</xml_diff>